<commit_message>
fix: disable public signup and update onboarding doc
Close the public /auth/v1/signup endpoint since account provisioning
is entirely server-side (invite/admin-set password flows) — flagged by
pentest finding-supabase-signup-bypass.

Co-Authored-By: Claude Sonnet 5 <noreply@anthropic.com>
</commit_message>
<xml_diff>
--- a/onboarding/Carrileen_Portal_Access_Email.docx
+++ b/onboarding/Carrileen_Portal_Access_Email.docx
@@ -21,7 +21,7 @@
     </w:p>
     <w:p>
       <w:r>
-        <w:t>Following up on what we discussed — the CHA Employee Portal is ready for you to start setting up real employee data ahead of our 30-day beta run alongside the existing system. Here's everything you need to get started.</w:t>
+        <w:t>Following up on what we discussed — the CHA Employee Portal is ready for you to start setting up real employee data ahead of our 30-day beta run alongside the existing system. The sooner your roster is in, the sooner that 30-day clock can start, so if you're able to log in and get the upload done this week, that would keep us on track. Here's everything you need to get started.</w:t>
       </w:r>
     </w:p>
     <w:p/>
@@ -220,7 +220,13 @@
         <w:t xml:space="preserve">Salary Data Intake — </w:t>
       </w:r>
       <w:r>
-        <w:t>compensation data. This one is restricted circulation — please don’t forward it or email it back and forth; complete it and upload it directly through the portal instead.</w:t>
+        <w:t>compensation data.</w:t>
+      </w:r>
+    </w:p>
+    <w:p>
+      <w:pPr/>
+      <w:r>
+        <w:t>A security note on all three: once completed, please upload these directly through the portal’s Data Import page rather than emailing them back to us — that’s also how the data actually gets validated and loaded, so there’s no extra step. If you ever do need to send a completed file by email for any reason, please make sure it’s encrypted or password-protected first — these carry personal information (addresses, compensation, leave balances) that shouldn’t travel over plain email.</w:t>
       </w:r>
     </w:p>
     <w:p>

</xml_diff>